<commit_message>
Branche Snowflake sur un compte d'essai : export réel, DAG activé, requêtes exécutées
Premier export réel le 25/09/2026 : 57 121 puis 59 119 transactions dans
fact_transactions, rejeu par le DAG Airflow sans doublon (MERGE idempotent),
Dynamic Table créée, 0,024 crédit consommé.

Deux bugs invisibles en dry-run corrigés dans etl/load_snowflake.py :
- executemany sur un MERGE / INSERT ... SELECT (erreur 252001) : chaque lot
  passe par une table temporaire, dimensions et faits en requêtes ensemblistes
- sous-requête corrélée dans le VALUES d'un MERGE : clés résolues par LEFT JOIN
- --date {{ ds }} dans le DAG : le run de 02:00 exportait le jour qui commence

Nouvelle cible make snowflake-check (etl/snowflake_queries_check.py) qui
rejoue queries/snowflake_olap.sql ; en-tête USE SCHEMA aligné sur le schéma
réel. Documentation, diagrammes, slides 3/5/8, speech et documents Word :
Snowflake passe de « dry-run » à « compte d'essai branché ».
</commit_message>
<xml_diff>
--- a/presentation/stripe_bloc2_competences.docx
+++ b/presentation/stripe_bloc2_competences.docx
@@ -1800,7 +1800,7 @@
                 <w:sz w:val="18"/>
                 <w:szCs w:val="18"/>
               </w:rPr>
-              <w:t xml:space="preserve">Schéma Snowflake prêt, chargement en dry-run</w:t>
+              <w:t xml:space="preserve">Snowflake (compte d’essai) : schéma en étoile, export quotidien réel, requêtes exécutées</w:t>
             </w:r>
           </w:p>
         </w:tc>
@@ -3584,7 +3584,7 @@
       <w:r>
         <w:drawing>
           <wp:inline distT="0" distB="0" distL="0" distR="0">
-            <wp:extent cx="5715000" cy="3714750"/>
+            <wp:extent cx="5715000" cy="3752850"/>
             <wp:effectExtent t="0" r="0" b="0" l="0"/>
             <wp:docPr id="1" name="Architecture physique de la cible AWS, fidèle à terraform/envs/prod" descr="Architecture physique de la cible AWS, fidèle à terraform/envs/prod" title="Architecture physique de la cible AWS, fidèle à terraform/envs/prod"/>
             <wp:cNvGraphicFramePr>
@@ -3609,7 +3609,7 @@
                   <pic:spPr bwMode="auto">
                     <a:xfrm>
                       <a:off x="0" y="0"/>
-                      <a:ext cx="5715000" cy="3714750"/>
+                      <a:ext cx="5715000" cy="3752850"/>
                     </a:xfrm>
                     <a:prstGeom prst="rect">
                       <a:avLst/>
@@ -11979,7 +11979,7 @@
         <w:spacing w:after="140" w:line="288"/>
       </w:pPr>
       <w:r>
-        <w:t xml:space="preserve">Le PoC prouve, à coût quasi nul, que la chaîne complète fonctionne : transaction, capture de changement, scoring surveillé, persistance et restitution. Le passage en production ne change pas la logique : il remplace des conteneurs par des services managés, décrits en Terraform et chiffrés en FinOps. Les écarts restants sont identifiés : Terraform non appliqué, Snowflake non connecté, bases vectorielles à construire.</w:t>
+        <w:t xml:space="preserve">Le PoC prouve, à coût quasi nul, que la chaîne complète fonctionne : transaction, capture de changement, scoring surveillé, persistance et restitution. Le passage en production ne change pas la logique : il remplace des conteneurs par des services managés, décrits en Terraform et chiffrés en FinOps. Les écarts restants sont identifiés : Terraform non appliqué, Snowflake sur un compte d’essai, bases vectorielles à construire.</w:t>
       </w:r>
     </w:p>
     <w:sectPr>

</xml_diff>